<commit_message>
describe what you changed
</commit_message>
<xml_diff>
--- a/Numerical Analysis Project Guide CS-252.docx
+++ b/Numerical Analysis Project Guide CS-252.docx
@@ -2524,41 +2524,12 @@
     </w:p>
     <w:p>
       <w:r>
-        <w:t>[</w:t>
-      </w:r>
-      <w:r>
-        <w:t>Numerical analysis is the study of algorithms that use numerical approximation for the problems of mathematical analysis. This project aims to implement various numerical methods to solve non-linear equations, systems of linear equations, and optimization problems using modern programming techniques.</w:t>
-      </w:r>
-      <w:r>
-        <w:t>]</w:t>
+        <w:t>Numerical analysis is a branch of mathematics concerned with developing algorithms to obtain approximate solutions for complex mathematical problems that cannot be solved analytically. This project presents the design and implementation of a Numerical Methods Solver capable of handling both non-linear equations and systems of linear equations. The application integrates multiple numerical techniques within a user-friendly interface, allowing users to compute accurate solutions efficiently while observing intermediate steps.</w:t>
       </w:r>
     </w:p>
     <w:p/>
-    <w:p>
-      <w:r>
-        <w:t>[</w:t>
-      </w:r>
-      <w:r>
-        <w:t>Numerical analysis is the study of algorithms that use numerical approximation for the problems of mathematical analysis. This project aims to implement various numerical methods to solve non-linear equations, systems of linear equations, and optimization problems using modern programming techniques.</w:t>
-      </w:r>
-      <w:r>
-        <w:t>]</w:t>
-      </w:r>
-    </w:p>
     <w:p/>
     <w:p>
-      <w:r>
-        <w:t>[</w:t>
-      </w:r>
-      <w:r>
-        <w:t>Numerical analysis is the study of algorithms that use numerical approximation for the problems of mathematical analysis. This project aims to implement various numerical methods to solve non-linear equations, systems of linear equations, and optimization problems using modern programming techniques.</w:t>
-      </w:r>
-      <w:r>
-        <w:t>]</w:t>
-      </w:r>
-    </w:p>
-    <w:p/>
-    <w:p>
       <w:pPr>
         <w:pStyle w:val="Heading2"/>
       </w:pPr>
@@ -2567,16 +2538,6 @@
         <w:t>Objectives</w:t>
       </w:r>
       <w:bookmarkEnd w:id="2"/>
-    </w:p>
-    <w:p>
-      <w:r>
-        <w:t xml:space="preserve">[Write short pullets describing the objectives of your application for </w:t>
-      </w:r>
-      <w:proofErr w:type="gramStart"/>
-      <w:r>
-        <w:t>example ]</w:t>
-      </w:r>
-      <w:proofErr w:type="gramEnd"/>
     </w:p>
     <w:p>
       <w:pPr>
@@ -2586,7 +2547,7 @@
         </w:numPr>
       </w:pPr>
       <w:r>
-        <w:t>Develop a user-friendly GUI to solve complex mathematical problems.</w:t>
+        <w:t xml:space="preserve">Design and implement an interactive application for solving numerical problems. </w:t>
       </w:r>
     </w:p>
     <w:p>
@@ -2597,7 +2558,7 @@
         </w:numPr>
       </w:pPr>
       <w:r>
-        <w:t>Implement Chapter 1 methods (Root Finding) and Chapter 2 methods (Linear Systems).</w:t>
+        <w:t xml:space="preserve">Apply root-finding methods such as Bisection, False Position, Newton-Raphson, Secant, and Fixed Point.  </w:t>
       </w:r>
     </w:p>
     <w:p>
@@ -2608,7 +2569,7 @@
         </w:numPr>
       </w:pPr>
       <w:r>
-        <w:t>Ensure high precision and handle mathematical errors (like division by zero).</w:t>
+        <w:t xml:space="preserve">Solve systems of linear equations using methods like Gauss Elimination, LU Decomposition, Cramer’s Rule, and Gauss-Jordan.  </w:t>
       </w:r>
     </w:p>
     <w:p>
@@ -2619,145 +2580,21 @@
         </w:numPr>
       </w:pPr>
       <w:r>
-        <w:t>Provide step-by-step solutions for educational purposes.</w:t>
-      </w:r>
-    </w:p>
-    <w:p>
-      <w:pPr>
-        <w:pStyle w:val="Heading2"/>
-      </w:pPr>
-      <w:bookmarkStart w:id="3" w:name="_Toc221898851"/>
-      <w:r>
-        <w:t>Tools &amp; Technologies Used</w:t>
-      </w:r>
-      <w:bookmarkEnd w:id="3"/>
-    </w:p>
-    <w:p>
-      <w:pPr>
-        <w:pStyle w:val="Heading3"/>
-      </w:pPr>
-      <w:bookmarkStart w:id="4" w:name="_Toc221898852"/>
-      <w:r>
-        <w:t>Programming Language</w:t>
-      </w:r>
-      <w:bookmarkEnd w:id="4"/>
-    </w:p>
-    <w:p>
-      <w:pPr>
-        <w:ind w:left="720"/>
-      </w:pPr>
-      <w:r>
-        <w:t xml:space="preserve"> (e.g., Python, C#, Java</w:t>
-      </w:r>
-      <w:r>
-        <w:t xml:space="preserve"> </w:t>
-      </w:r>
-      <w:proofErr w:type="gramStart"/>
-      <w:r>
-        <w:t>“ you</w:t>
-      </w:r>
-      <w:proofErr w:type="gramEnd"/>
-      <w:r>
-        <w:t xml:space="preserve"> are free to use any </w:t>
-      </w:r>
-      <w:proofErr w:type="gramStart"/>
-      <w:r>
-        <w:t xml:space="preserve">“ </w:t>
-      </w:r>
-      <w:r>
-        <w:t>)</w:t>
-      </w:r>
-      <w:proofErr w:type="gramEnd"/>
-      <w:r>
-        <w:t xml:space="preserve"> describe why and where the team used these languages</w:t>
-      </w:r>
-    </w:p>
-    <w:p>
-      <w:pPr>
-        <w:pStyle w:val="Heading3"/>
-      </w:pPr>
-      <w:bookmarkStart w:id="5" w:name="_Toc221898853"/>
-      <w:r>
-        <w:lastRenderedPageBreak/>
-        <w:t>GUI Framework</w:t>
-      </w:r>
-      <w:bookmarkEnd w:id="5"/>
-    </w:p>
-    <w:p>
-      <w:pPr>
-        <w:ind w:left="720"/>
-      </w:pPr>
-      <w:r>
-        <w:t xml:space="preserve"> (</w:t>
-      </w:r>
-      <w:r>
-        <w:t>HTML&amp;CSS</w:t>
-      </w:r>
-      <w:r>
-        <w:t>)</w:t>
-      </w:r>
-    </w:p>
-    <w:p>
-      <w:pPr>
-        <w:pStyle w:val="Heading3"/>
-      </w:pPr>
-      <w:bookmarkStart w:id="6" w:name="_Toc221898854"/>
-      <w:r>
-        <w:t>Libraries</w:t>
-      </w:r>
-      <w:bookmarkEnd w:id="6"/>
-    </w:p>
-    <w:p>
-      <w:pPr>
-        <w:ind w:left="720"/>
-      </w:pPr>
-      <w:r>
-        <w:t>(</w:t>
-      </w:r>
-      <w:r>
-        <w:t xml:space="preserve">Math.js &amp; bootstrap &amp; </w:t>
-      </w:r>
-      <w:r>
-        <w:t>html2pdf.js</w:t>
-      </w:r>
-      <w:r>
-        <w:t>)</w:t>
-      </w:r>
-    </w:p>
-    <w:p>
-      <w:pPr>
-        <w:pStyle w:val="Heading3"/>
-      </w:pPr>
-      <w:bookmarkStart w:id="7" w:name="_Toc221898855"/>
-      <w:r>
-        <w:t>IDE</w:t>
-      </w:r>
-      <w:bookmarkEnd w:id="7"/>
-    </w:p>
-    <w:p>
-      <w:pPr>
-        <w:ind w:left="720"/>
-      </w:pPr>
-      <w:r>
-        <w:t xml:space="preserve"> (VS Code)</w:t>
-      </w:r>
-    </w:p>
-    <w:p>
-      <w:pPr>
-        <w:pStyle w:val="Heading3"/>
-      </w:pPr>
-      <w:bookmarkStart w:id="8" w:name="_Toc221898856"/>
-      <w:r>
-        <w:t>Other tools</w:t>
-      </w:r>
-      <w:bookmarkEnd w:id="8"/>
-      <w:r>
-        <w:t xml:space="preserve"> </w:t>
-      </w:r>
-    </w:p>
-    <w:p>
-      <w:r>
-        <w:tab/>
+        <w:t xml:space="preserve">Provide accurate and efficient computations with proper error handling.  </w:t>
+      </w:r>
+    </w:p>
+    <w:p>
+      <w:pPr>
+        <w:numPr>
+          <w:ilvl w:val="0"/>
+          <w:numId w:val="3"/>
+        </w:numPr>
+      </w:pPr>
+      <w:r>
+        <w:t>Display step-by-step iterations to enhance user understanding</w:t>
+      </w:r>
+      <w:r>
+        <w:t>.</w:t>
       </w:r>
     </w:p>
     <w:p/>
@@ -2769,8 +2606,182 @@
     <w:p/>
     <w:p/>
     <w:p/>
+    <w:p>
+      <w:pPr>
+        <w:pStyle w:val="Heading2"/>
+      </w:pPr>
+      <w:bookmarkStart w:id="3" w:name="_Toc221898851"/>
+      <w:r>
+        <w:lastRenderedPageBreak/>
+        <w:t>Tools &amp; Technologies Used</w:t>
+      </w:r>
+      <w:bookmarkEnd w:id="3"/>
+    </w:p>
+    <w:p>
+      <w:pPr>
+        <w:pStyle w:val="Heading3"/>
+        <w:ind w:left="0"/>
+      </w:pPr>
+      <w:bookmarkStart w:id="4" w:name="_Toc221898852"/>
+      <w:r>
+        <w:t>1-</w:t>
+      </w:r>
+      <w:r>
+        <w:t>Programming Language</w:t>
+      </w:r>
+      <w:bookmarkEnd w:id="4"/>
+    </w:p>
+    <w:p>
+      <w:pPr>
+        <w:ind w:left="720"/>
+      </w:pPr>
+      <w:r>
+        <w:t xml:space="preserve"> </w:t>
+      </w:r>
+      <w:r>
+        <w:t xml:space="preserve">JavaScript was used due to its flexibility and ability to build interactive applications, especially when combined with modern frameworks for graphical user interfaces. It allows efficient handling of user </w:t>
+      </w:r>
+      <w:proofErr w:type="gramStart"/>
+      <w:r>
+        <w:t>inputs</w:t>
+      </w:r>
+      <w:proofErr w:type="gramEnd"/>
+      <w:r>
+        <w:t>, real-time computations, and dynamic result visualization. Additionally, JavaScript provides access to mathematical libraries that simplify the implementation of numerical methods.</w:t>
+      </w:r>
+    </w:p>
+    <w:p>
+      <w:pPr>
+        <w:pStyle w:val="Heading3"/>
+        <w:ind w:left="0"/>
+      </w:pPr>
+      <w:bookmarkStart w:id="5" w:name="_Toc221898853"/>
+      <w:r>
+        <w:t>2-</w:t>
+      </w:r>
+      <w:r>
+        <w:t>GUI Framework</w:t>
+      </w:r>
+      <w:bookmarkEnd w:id="5"/>
+    </w:p>
+    <w:p>
+      <w:r>
+        <w:t>(</w:t>
+      </w:r>
+      <w:r>
+        <w:t>HTML&amp;CSS</w:t>
+      </w:r>
+      <w:r>
+        <w:t>)</w:t>
+      </w:r>
+    </w:p>
+    <w:p>
+      <w:pPr>
+        <w:pStyle w:val="Heading3"/>
+        <w:ind w:left="0"/>
+      </w:pPr>
+      <w:bookmarkStart w:id="6" w:name="_Toc221898854"/>
+      <w:r>
+        <w:t>3-</w:t>
+      </w:r>
+      <w:r>
+        <w:t>Libraries</w:t>
+      </w:r>
+      <w:bookmarkEnd w:id="6"/>
+    </w:p>
+    <w:p>
+      <w:r>
+        <w:t>Math.js was used for performing mathematical computations and </w:t>
+      </w:r>
+      <w:proofErr w:type="gramStart"/>
+      <w:r>
+        <w:t>handling  </w:t>
+      </w:r>
+      <w:r>
+        <w:tab/>
+      </w:r>
+      <w:proofErr w:type="gramEnd"/>
+      <w:r>
+        <w:tab/>
+        <w:t>expressions efficiently. </w:t>
+      </w:r>
+    </w:p>
+    <w:p>
+      <w:r>
+        <w:t>Html2pdf</w:t>
+      </w:r>
+      <w:r>
+        <w:t>.js</w:t>
+      </w:r>
+      <w:r>
+        <w:t xml:space="preserve"> to </w:t>
+      </w:r>
+      <w:proofErr w:type="gramStart"/>
+      <w:r>
+        <w:t>covert</w:t>
+      </w:r>
+      <w:proofErr w:type="gramEnd"/>
+      <w:r>
+        <w:t> the answers to pdf. </w:t>
+      </w:r>
+    </w:p>
+    <w:p>
+      <w:r>
+        <w:t xml:space="preserve">bootstrap </w:t>
+      </w:r>
+    </w:p>
+    <w:p>
+      <w:pPr>
+        <w:pStyle w:val="Heading3"/>
+        <w:ind w:left="0"/>
+      </w:pPr>
+      <w:bookmarkStart w:id="7" w:name="_Toc221898855"/>
+      <w:r>
+        <w:t>4-</w:t>
+      </w:r>
+      <w:r>
+        <w:t>IDE</w:t>
+      </w:r>
+      <w:bookmarkStart w:id="8" w:name="_Toc221898856"/>
+      <w:bookmarkEnd w:id="7"/>
+    </w:p>
+    <w:p>
+      <w:pPr>
+        <w:rPr>
+          <w:rFonts w:eastAsiaTheme="majorEastAsia"/>
+        </w:rPr>
+      </w:pPr>
+      <w:r>
+        <w:t>Visual Studio Code was used for writing, debugging, and managing the project.</w:t>
+      </w:r>
+    </w:p>
+    <w:p>
+      <w:pPr>
+        <w:pStyle w:val="Heading3"/>
+        <w:ind w:left="0"/>
+      </w:pPr>
+      <w:r>
+        <w:t>5-</w:t>
+      </w:r>
+      <w:r>
+        <w:t>Other tools</w:t>
+      </w:r>
+      <w:bookmarkEnd w:id="8"/>
+      <w:r>
+        <w:t xml:space="preserve"> </w:t>
+      </w:r>
+    </w:p>
+    <w:p>
+      <w:r>
+        <w:t>GitHub was used for version control and collaboration.</w:t>
+      </w:r>
+    </w:p>
     <w:p/>
-    <w:p/>
+    <w:p>
+      <w:r>
+        <w:tab/>
+      </w:r>
+    </w:p>
     <w:p/>
     <w:p/>
     <w:p/>
@@ -2848,214 +2859,170 @@
           <w:sz w:val="32"/>
           <w:szCs w:val="32"/>
         </w:rPr>
-        <w:t>How to Use the Application</w:t>
-      </w:r>
-      <w:r>
-        <w:rPr>
-          <w:b/>
-          <w:bCs/>
+        <w:t>How to Use the Application:</w:t>
+      </w:r>
+    </w:p>
+    <w:p>
+      <w:pPr>
+        <w:rPr>
+          <w:sz w:val="28"/>
+          <w:szCs w:val="28"/>
+        </w:rPr>
+      </w:pPr>
+      <w:r>
+        <w:rPr>
+          <w:sz w:val="28"/>
+          <w:szCs w:val="28"/>
+        </w:rPr>
+        <w:t>1-Select the required solving method from the Method dropdown list.</w:t>
+      </w:r>
+    </w:p>
+    <w:p>
+      <w:pPr>
+        <w:rPr>
+          <w:sz w:val="28"/>
+          <w:szCs w:val="28"/>
+        </w:rPr>
+      </w:pPr>
+      <w:r>
+        <w:rPr>
+          <w:sz w:val="28"/>
+          <w:szCs w:val="28"/>
+        </w:rPr>
+        <w:t>2-Enter the required input values.</w:t>
+      </w:r>
+    </w:p>
+    <w:p>
+      <w:pPr>
+        <w:rPr>
+          <w:sz w:val="28"/>
+          <w:szCs w:val="28"/>
+        </w:rPr>
+      </w:pPr>
+      <w:r>
+        <w:rPr>
+          <w:sz w:val="28"/>
+          <w:szCs w:val="28"/>
+        </w:rPr>
+        <w:t>3-Click the Solve button to perform calculations.</w:t>
+      </w:r>
+    </w:p>
+    <w:p>
+      <w:pPr>
+        <w:rPr>
+          <w:sz w:val="28"/>
+          <w:szCs w:val="28"/>
+        </w:rPr>
+      </w:pPr>
+      <w:r>
+        <w:rPr>
+          <w:sz w:val="28"/>
+          <w:szCs w:val="28"/>
+        </w:rPr>
+        <w:t>4-View the result and iteration steps.</w:t>
+      </w:r>
+    </w:p>
+    <w:p>
+      <w:pPr>
+        <w:rPr>
+          <w:sz w:val="28"/>
+          <w:szCs w:val="28"/>
+        </w:rPr>
+      </w:pPr>
+      <w:r>
+        <w:rPr>
+          <w:sz w:val="28"/>
+          <w:szCs w:val="28"/>
+        </w:rPr>
+        <w:t>5-Click Export to PDF to save the output.</w:t>
+      </w:r>
+    </w:p>
+    <w:p>
+      <w:pPr>
+        <w:rPr>
           <w:sz w:val="32"/>
           <w:szCs w:val="32"/>
         </w:rPr>
-        <w:t>:</w:t>
-      </w:r>
-    </w:p>
-    <w:p>
-      <w:pPr>
-        <w:rPr>
-          <w:sz w:val="28"/>
-          <w:szCs w:val="28"/>
-        </w:rPr>
-      </w:pPr>
-      <w:r>
-        <w:rPr>
-          <w:sz w:val="28"/>
-          <w:szCs w:val="28"/>
-        </w:rPr>
-        <w:t>1-</w:t>
-      </w:r>
-      <w:r>
-        <w:rPr>
-          <w:sz w:val="28"/>
-          <w:szCs w:val="28"/>
-        </w:rPr>
-        <w:t>Select the required solving method from the Method dropdown list.</w:t>
-      </w:r>
-    </w:p>
-    <w:p>
-      <w:pPr>
-        <w:rPr>
-          <w:sz w:val="28"/>
-          <w:szCs w:val="28"/>
-        </w:rPr>
-      </w:pPr>
-      <w:r>
-        <w:rPr>
-          <w:sz w:val="28"/>
-          <w:szCs w:val="28"/>
-        </w:rPr>
-        <w:t>2-</w:t>
-      </w:r>
-      <w:r>
-        <w:rPr>
-          <w:sz w:val="28"/>
-          <w:szCs w:val="28"/>
-        </w:rPr>
-        <w:t>Enter the required input values.</w:t>
-      </w:r>
-    </w:p>
-    <w:p>
-      <w:pPr>
-        <w:rPr>
-          <w:sz w:val="28"/>
-          <w:szCs w:val="28"/>
-        </w:rPr>
-      </w:pPr>
-      <w:r>
-        <w:rPr>
-          <w:sz w:val="28"/>
-          <w:szCs w:val="28"/>
-        </w:rPr>
-        <w:t>3-</w:t>
-      </w:r>
-      <w:r>
-        <w:rPr>
-          <w:sz w:val="28"/>
-          <w:szCs w:val="28"/>
-        </w:rPr>
-        <w:t>Click the Solve button to perform calculations.</w:t>
-      </w:r>
-    </w:p>
-    <w:p>
-      <w:pPr>
-        <w:rPr>
-          <w:sz w:val="28"/>
-          <w:szCs w:val="28"/>
-        </w:rPr>
-      </w:pPr>
-      <w:r>
-        <w:rPr>
-          <w:sz w:val="28"/>
-          <w:szCs w:val="28"/>
-        </w:rPr>
-        <w:t>4-</w:t>
-      </w:r>
-      <w:r>
-        <w:rPr>
-          <w:sz w:val="28"/>
-          <w:szCs w:val="28"/>
-        </w:rPr>
-        <w:t>View the result and iteration steps.</w:t>
-      </w:r>
-    </w:p>
-    <w:p>
-      <w:pPr>
-        <w:rPr>
-          <w:sz w:val="28"/>
-          <w:szCs w:val="28"/>
-        </w:rPr>
-      </w:pPr>
-      <w:r>
-        <w:rPr>
-          <w:sz w:val="28"/>
-          <w:szCs w:val="28"/>
-        </w:rPr>
-        <w:t>5-</w:t>
-      </w:r>
-      <w:r>
-        <w:rPr>
-          <w:sz w:val="28"/>
-          <w:szCs w:val="28"/>
-        </w:rPr>
-        <w:t>Click Export to PDF to save the output.</w:t>
-      </w:r>
-    </w:p>
-    <w:p>
-      <w:pPr>
+      </w:pPr>
+      <w:r>
         <w:rPr>
           <w:sz w:val="32"/>
           <w:szCs w:val="32"/>
         </w:rPr>
-      </w:pPr>
-      <w:r>
-        <w:rPr>
+        <w:t>1. Root-Finding Methods</w:t>
+      </w:r>
+    </w:p>
+    <w:p>
+      <w:r>
+        <w:t>For these methods, the user must enter a mathematical function in the f(x) field.</w:t>
+      </w:r>
+    </w:p>
+    <w:p>
+      <w:r>
+        <w:t>Examples:</w:t>
+      </w:r>
+    </w:p>
+    <w:p>
+      <w:r>
+        <w:t>x^2 - 4</w:t>
+      </w:r>
+    </w:p>
+    <w:p>
+      <w:r>
+        <w:t>sin(x) - x/2</w:t>
+      </w:r>
+    </w:p>
+    <w:p>
+      <w:r>
+        <w:t>log(x) - 1</w:t>
+      </w:r>
+    </w:p>
+    <w:p>
+      <w:pPr>
+        <w:rPr>
+          <w:b/>
+          <w:bCs/>
+        </w:rPr>
+      </w:pPr>
+      <w:r>
+        <w:rPr>
+          <w:b/>
+          <w:bCs/>
+        </w:rPr>
+        <w:t>Required inputs:</w:t>
+      </w:r>
+    </w:p>
+    <w:p>
+      <w:r>
+        <w:t>Bisection / False Position: lower bound xl and upper bound xu</w:t>
+      </w:r>
+    </w:p>
+    <w:p>
+      <w:r>
+        <w:t>Fixed Point / Newton: initial guess x₀</w:t>
+      </w:r>
+    </w:p>
+    <w:p>
+      <w:r>
+        <w:t>Secant: initial guesses x₀ and x₁</w:t>
+      </w:r>
+    </w:p>
+    <w:p>
+      <w:pPr>
+        <w:rPr>
+          <w:b/>
+          <w:bCs/>
           <w:sz w:val="32"/>
           <w:szCs w:val="32"/>
         </w:rPr>
-        <w:t>1. Root-Finding Methods</w:t>
-      </w:r>
-    </w:p>
-    <w:p>
-      <w:r>
-        <w:t>For these methods, the user must enter a mathematical function in the f(x) field.</w:t>
-      </w:r>
-    </w:p>
-    <w:p>
-      <w:r>
-        <w:t>Examples:</w:t>
-      </w:r>
-    </w:p>
-    <w:p>
-      <w:r>
-        <w:t>x^2 - 4</w:t>
-      </w:r>
-    </w:p>
-    <w:p>
-      <w:r>
-        <w:t>sin(x) - x/2</w:t>
-      </w:r>
-    </w:p>
-    <w:p>
-      <w:r>
-        <w:t>log(x) - 1</w:t>
-      </w:r>
-    </w:p>
-    <w:p>
-      <w:pPr>
-        <w:rPr>
-          <w:b/>
-          <w:bCs/>
-        </w:rPr>
-      </w:pPr>
-      <w:r>
-        <w:rPr>
-          <w:b/>
-          <w:bCs/>
-        </w:rPr>
-        <w:t>Required inputs:</w:t>
-      </w:r>
-    </w:p>
-    <w:p>
-      <w:r>
-        <w:t>Bisection / False Position: lower bound xl and upper bound xu</w:t>
-      </w:r>
-    </w:p>
-    <w:p>
-      <w:r>
-        <w:t>Fixed Point / Newton: initial guess x₀</w:t>
-      </w:r>
-    </w:p>
-    <w:p>
-      <w:r>
-        <w:t>Secant: initial guesses x₀ and x₁</w:t>
-      </w:r>
-    </w:p>
-    <w:p>
-      <w:pPr>
+      </w:pPr>
+      <w:r>
         <w:rPr>
           <w:b/>
           <w:bCs/>
           <w:sz w:val="32"/>
           <w:szCs w:val="32"/>
         </w:rPr>
-      </w:pPr>
-      <w:r>
-        <w:rPr>
-          <w:b/>
-          <w:bCs/>
-          <w:sz w:val="32"/>
-          <w:szCs w:val="32"/>
-        </w:rPr>
         <w:t>2. Linear System Methods</w:t>
       </w:r>
     </w:p>
@@ -3131,21 +3098,6 @@
         <w:t>Methods Implementation &amp; Results</w:t>
       </w:r>
       <w:bookmarkEnd w:id="10"/>
-    </w:p>
-    <w:p>
-      <w:pPr>
-        <w:rPr>
-          <w:i/>
-          <w:iCs/>
-        </w:rPr>
-      </w:pPr>
-      <w:r>
-        <w:rPr>
-          <w:i/>
-          <w:iCs/>
-        </w:rPr>
-        <w:t>(Note: Each method below must follow the 2-page rule: Page 1 for Code, Page 2 for GUI Output)</w:t>
-      </w:r>
     </w:p>
     <w:p>
       <w:pPr>
@@ -3176,12 +3128,12 @@
     <w:p>
       <w:pPr>
         <w:pStyle w:val="Heading3"/>
-        <w:numPr>
-          <w:ilvl w:val="0"/>
-          <w:numId w:val="13"/>
-        </w:numPr>
+        <w:ind w:left="0"/>
       </w:pPr>
       <w:bookmarkStart w:id="12" w:name="_Toc221898860"/>
+      <w:r>
+        <w:t>1.</w:t>
+      </w:r>
       <w:r>
         <w:t xml:space="preserve">Bisection </w:t>
       </w:r>
@@ -3207,19 +3159,16 @@
     </w:p>
     <w:p>
       <w:pPr>
-        <w:numPr>
-          <w:ilvl w:val="0"/>
-          <w:numId w:val="5"/>
-        </w:numPr>
+        <w:ind w:left="180"/>
       </w:pPr>
       <w:r>
         <w:rPr>
           <w:noProof/>
         </w:rPr>
         <w:drawing>
-          <wp:inline distT="0" distB="0" distL="0" distR="0" wp14:anchorId="0299C673" wp14:editId="605ED229">
-            <wp:extent cx="5943600" cy="2785745"/>
-            <wp:effectExtent l="0" t="0" r="0" b="0"/>
+          <wp:inline distT="0" distB="0" distL="0" distR="0" wp14:anchorId="0299C673" wp14:editId="22015AF4">
+            <wp:extent cx="5943600" cy="3667125"/>
+            <wp:effectExtent l="0" t="0" r="0" b="9525"/>
             <wp:docPr id="1641939891" name="Picture 1"/>
             <wp:cNvGraphicFramePr>
               <a:graphicFrameLocks xmlns:a="http://schemas.openxmlformats.org/drawingml/2006/main" noChangeAspect="1"/>
@@ -3240,7 +3189,7 @@
                   <pic:spPr>
                     <a:xfrm>
                       <a:off x="0" y="0"/>
-                      <a:ext cx="5943600" cy="2785745"/>
+                      <a:ext cx="5943600" cy="3667125"/>
                     </a:xfrm>
                     <a:prstGeom prst="rect">
                       <a:avLst/>
@@ -3259,27 +3208,38 @@
         </w:rPr>
         <w:t xml:space="preserve"> </w:t>
       </w:r>
-      <w:r>
-        <w:rPr>
-          <w:b/>
-          <w:bCs/>
-        </w:rPr>
+    </w:p>
+    <w:p>
+      <w:pPr>
+        <w:ind w:left="630"/>
+      </w:pPr>
+    </w:p>
+    <w:p/>
+    <w:p/>
+    <w:p/>
+    <w:p/>
+    <w:p/>
+    <w:p/>
+    <w:p/>
+    <w:p>
+      <w:r>
+        <w:lastRenderedPageBreak/>
         <w:t>Page B: Output (GUI Screenshot)</w:t>
       </w:r>
+    </w:p>
+    <w:p>
+      <w:pPr>
+        <w:ind w:left="270"/>
+        <w:jc w:val="center"/>
+      </w:pPr>
       <w:r>
         <w:rPr>
           <w:noProof/>
         </w:rPr>
-        <w:t xml:space="preserve"> </w:t>
-      </w:r>
-      <w:r>
-        <w:rPr>
-          <w:noProof/>
-        </w:rPr>
         <w:drawing>
-          <wp:inline distT="0" distB="0" distL="0" distR="0" wp14:anchorId="2528C704" wp14:editId="4AA14957">
-            <wp:extent cx="5943600" cy="2571750"/>
-            <wp:effectExtent l="0" t="0" r="0" b="0"/>
+          <wp:inline distT="0" distB="0" distL="0" distR="0" wp14:anchorId="2528C704" wp14:editId="7A18E7D5">
+            <wp:extent cx="6448425" cy="4019550"/>
+            <wp:effectExtent l="0" t="0" r="9525" b="0"/>
             <wp:docPr id="2084054156" name="Picture 1"/>
             <wp:cNvGraphicFramePr>
               <a:graphicFrameLocks xmlns:a="http://schemas.openxmlformats.org/drawingml/2006/main" noChangeAspect="1"/>
@@ -3300,7 +3260,7 @@
                   <pic:spPr>
                     <a:xfrm>
                       <a:off x="0" y="0"/>
-                      <a:ext cx="5943600" cy="2571750"/>
+                      <a:ext cx="6448425" cy="4019550"/>
                     </a:xfrm>
                     <a:prstGeom prst="rect">
                       <a:avLst/>
@@ -3318,8 +3278,27 @@
         <w:pStyle w:val="Heading3"/>
       </w:pPr>
       <w:bookmarkStart w:id="13" w:name="_Toc221898861"/>
+    </w:p>
+    <w:p/>
+    <w:p/>
+    <w:p/>
+    <w:p/>
+    <w:p/>
+    <w:p/>
+    <w:p/>
+    <w:p/>
+    <w:p/>
+    <w:p/>
+    <w:p>
+      <w:pPr>
+        <w:pStyle w:val="Heading3"/>
+        <w:ind w:left="0"/>
+      </w:pPr>
       <w:r>
         <w:lastRenderedPageBreak/>
+        <w:t>2.</w:t>
+      </w:r>
+      <w:r>
         <w:t xml:space="preserve">False position </w:t>
       </w:r>
       <w:r>
@@ -3344,18 +3323,15 @@
     </w:p>
     <w:p>
       <w:pPr>
-        <w:numPr>
-          <w:ilvl w:val="0"/>
-          <w:numId w:val="5"/>
-        </w:numPr>
+        <w:ind w:left="270"/>
       </w:pPr>
       <w:r>
         <w:rPr>
           <w:noProof/>
         </w:rPr>
         <w:drawing>
-          <wp:inline distT="0" distB="0" distL="0" distR="0" wp14:anchorId="1B742400" wp14:editId="5195E572">
-            <wp:extent cx="5943600" cy="2786380"/>
+          <wp:inline distT="0" distB="0" distL="0" distR="0" wp14:anchorId="1B742400" wp14:editId="25A6D7A7">
+            <wp:extent cx="5943600" cy="6438900"/>
             <wp:effectExtent l="0" t="0" r="0" b="0"/>
             <wp:docPr id="1200582403" name="Picture 1"/>
             <wp:cNvGraphicFramePr>
@@ -3377,7 +3353,7 @@
                   <pic:spPr>
                     <a:xfrm>
                       <a:off x="0" y="0"/>
-                      <a:ext cx="5943600" cy="2786380"/>
+                      <a:ext cx="5943600" cy="6438900"/>
                     </a:xfrm>
                     <a:prstGeom prst="rect">
                       <a:avLst/>
@@ -3389,33 +3365,57 @@
           </wp:inline>
         </w:drawing>
       </w:r>
-      <w:r>
-        <w:rPr>
-          <w:b/>
-          <w:bCs/>
-        </w:rPr>
-        <w:t xml:space="preserve"> </w:t>
-      </w:r>
-      <w:r>
-        <w:rPr>
-          <w:b/>
-          <w:bCs/>
-        </w:rPr>
+    </w:p>
+    <w:p>
+      <w:pPr>
+        <w:ind w:left="720"/>
+      </w:pPr>
+    </w:p>
+    <w:p>
+      <w:pPr>
+        <w:ind w:left="720"/>
+      </w:pPr>
+    </w:p>
+    <w:p>
+      <w:pPr>
+        <w:ind w:left="720"/>
+      </w:pPr>
+    </w:p>
+    <w:p>
+      <w:pPr>
+        <w:numPr>
+          <w:ilvl w:val="0"/>
+          <w:numId w:val="5"/>
+        </w:numPr>
+      </w:pPr>
+      <w:r>
+        <w:rPr>
+          <w:b/>
+          <w:bCs/>
+        </w:rPr>
+        <w:lastRenderedPageBreak/>
         <w:t>Page B: Output (GUI Screenshot)</w:t>
       </w:r>
     </w:p>
     <w:p>
       <w:pPr>
-        <w:ind w:left="1440"/>
-        <w:jc w:val="center"/>
+        <w:ind w:left="180"/>
+      </w:pPr>
+    </w:p>
+    <w:p>
+      <w:pPr>
+        <w:rPr>
+          <w:b/>
+          <w:bCs/>
+        </w:rPr>
       </w:pPr>
       <w:r>
         <w:rPr>
           <w:noProof/>
         </w:rPr>
         <w:drawing>
-          <wp:inline distT="0" distB="0" distL="0" distR="0" wp14:anchorId="7676FB35" wp14:editId="2F3177F2">
-            <wp:extent cx="5257800" cy="2806065"/>
+          <wp:inline distT="0" distB="0" distL="0" distR="0" wp14:anchorId="480C3EE3" wp14:editId="63EA3762">
+            <wp:extent cx="6076950" cy="3810000"/>
             <wp:effectExtent l="0" t="0" r="0" b="0"/>
             <wp:docPr id="680487582" name="Picture 1"/>
             <wp:cNvGraphicFramePr>
@@ -3437,7 +3437,7 @@
                   <pic:spPr>
                     <a:xfrm>
                       <a:off x="0" y="0"/>
-                      <a:ext cx="5257800" cy="2806065"/>
+                      <a:ext cx="6076950" cy="3810000"/>
                     </a:xfrm>
                     <a:prstGeom prst="rect">
                       <a:avLst/>
@@ -3452,10 +3452,53 @@
     </w:p>
     <w:p>
       <w:pPr>
+        <w:rPr>
+          <w:b/>
+          <w:bCs/>
+        </w:rPr>
+      </w:pPr>
+    </w:p>
+    <w:p>
+      <w:pPr>
+        <w:rPr>
+          <w:b/>
+          <w:bCs/>
+        </w:rPr>
+      </w:pPr>
+    </w:p>
+    <w:p>
+      <w:pPr>
+        <w:rPr>
+          <w:b/>
+          <w:bCs/>
+        </w:rPr>
+      </w:pPr>
+    </w:p>
+    <w:p>
+      <w:pPr>
+        <w:rPr>
+          <w:b/>
+          <w:bCs/>
+        </w:rPr>
+      </w:pPr>
+    </w:p>
+    <w:p/>
+    <w:p>
+      <w:pPr>
+        <w:ind w:left="1440"/>
+        <w:jc w:val="center"/>
+      </w:pPr>
+    </w:p>
+    <w:p>
+      <w:pPr>
         <w:pStyle w:val="Heading3"/>
+        <w:ind w:left="0"/>
       </w:pPr>
       <w:r>
         <w:lastRenderedPageBreak/>
+        <w:t>3.</w:t>
+      </w:r>
+      <w:r>
         <w:t xml:space="preserve"> </w:t>
       </w:r>
       <w:bookmarkStart w:id="14" w:name="_Toc221898862"/>
@@ -3485,8 +3528,8 @@
           <w:noProof/>
         </w:rPr>
         <w:drawing>
-          <wp:inline distT="0" distB="0" distL="0" distR="0" wp14:anchorId="3F102370" wp14:editId="637E9AFD">
-            <wp:extent cx="5943600" cy="2630170"/>
+          <wp:inline distT="0" distB="0" distL="0" distR="0" wp14:anchorId="3F102370" wp14:editId="4008105C">
+            <wp:extent cx="5943600" cy="3260785"/>
             <wp:effectExtent l="0" t="0" r="0" b="0"/>
             <wp:docPr id="46920489" name="Picture 1"/>
             <wp:cNvGraphicFramePr>
@@ -3508,7 +3551,7 @@
                   <pic:spPr>
                     <a:xfrm>
                       <a:off x="0" y="0"/>
-                      <a:ext cx="5943600" cy="2630170"/>
+                      <a:ext cx="5945862" cy="3262026"/>
                     </a:xfrm>
                     <a:prstGeom prst="rect">
                       <a:avLst/>
@@ -3520,6 +3563,150 @@
           </wp:inline>
         </w:drawing>
       </w:r>
+    </w:p>
+    <w:p>
+      <w:pPr>
+        <w:ind w:left="720"/>
+        <w:rPr>
+          <w:b/>
+          <w:bCs/>
+        </w:rPr>
+      </w:pPr>
+    </w:p>
+    <w:p>
+      <w:pPr>
+        <w:ind w:left="720"/>
+        <w:rPr>
+          <w:b/>
+          <w:bCs/>
+        </w:rPr>
+      </w:pPr>
+    </w:p>
+    <w:p>
+      <w:pPr>
+        <w:ind w:left="720"/>
+        <w:rPr>
+          <w:b/>
+          <w:bCs/>
+        </w:rPr>
+      </w:pPr>
+    </w:p>
+    <w:p>
+      <w:pPr>
+        <w:ind w:left="720"/>
+        <w:rPr>
+          <w:b/>
+          <w:bCs/>
+        </w:rPr>
+      </w:pPr>
+    </w:p>
+    <w:p>
+      <w:pPr>
+        <w:ind w:left="720"/>
+        <w:rPr>
+          <w:b/>
+          <w:bCs/>
+        </w:rPr>
+      </w:pPr>
+    </w:p>
+    <w:p>
+      <w:pPr>
+        <w:ind w:left="720"/>
+        <w:rPr>
+          <w:b/>
+          <w:bCs/>
+        </w:rPr>
+      </w:pPr>
+    </w:p>
+    <w:p>
+      <w:pPr>
+        <w:ind w:left="720"/>
+        <w:rPr>
+          <w:b/>
+          <w:bCs/>
+        </w:rPr>
+      </w:pPr>
+    </w:p>
+    <w:p>
+      <w:pPr>
+        <w:ind w:left="720"/>
+        <w:rPr>
+          <w:b/>
+          <w:bCs/>
+        </w:rPr>
+      </w:pPr>
+    </w:p>
+    <w:p>
+      <w:pPr>
+        <w:ind w:left="720"/>
+        <w:rPr>
+          <w:b/>
+          <w:bCs/>
+        </w:rPr>
+      </w:pPr>
+    </w:p>
+    <w:p>
+      <w:pPr>
+        <w:ind w:left="720"/>
+        <w:rPr>
+          <w:b/>
+          <w:bCs/>
+        </w:rPr>
+      </w:pPr>
+    </w:p>
+    <w:p>
+      <w:pPr>
+        <w:ind w:left="720"/>
+        <w:rPr>
+          <w:b/>
+          <w:bCs/>
+        </w:rPr>
+      </w:pPr>
+    </w:p>
+    <w:p>
+      <w:pPr>
+        <w:ind w:left="720"/>
+        <w:rPr>
+          <w:b/>
+          <w:bCs/>
+        </w:rPr>
+      </w:pPr>
+    </w:p>
+    <w:p>
+      <w:pPr>
+        <w:ind w:left="720"/>
+        <w:rPr>
+          <w:b/>
+          <w:bCs/>
+        </w:rPr>
+      </w:pPr>
+    </w:p>
+    <w:p>
+      <w:pPr>
+        <w:ind w:left="720"/>
+        <w:rPr>
+          <w:b/>
+          <w:bCs/>
+        </w:rPr>
+      </w:pPr>
+    </w:p>
+    <w:p>
+      <w:pPr>
+        <w:ind w:left="720"/>
+        <w:rPr>
+          <w:b/>
+          <w:bCs/>
+        </w:rPr>
+      </w:pPr>
+    </w:p>
+    <w:p>
+      <w:pPr>
+        <w:ind w:left="720"/>
+        <w:rPr>
+          <w:b/>
+          <w:bCs/>
+        </w:rPr>
+      </w:pPr>
     </w:p>
     <w:p>
       <w:pPr>
@@ -3584,8 +3771,36 @@
         <w:pStyle w:val="Heading3"/>
       </w:pPr>
       <w:bookmarkStart w:id="15" w:name="_Toc221898863"/>
-      <w:r>
-        <w:lastRenderedPageBreak/>
+    </w:p>
+    <w:p>
+      <w:pPr>
+        <w:pStyle w:val="Heading3"/>
+      </w:pPr>
+    </w:p>
+    <w:p>
+      <w:pPr>
+        <w:pStyle w:val="Heading3"/>
+      </w:pPr>
+    </w:p>
+    <w:p>
+      <w:pPr>
+        <w:pStyle w:val="Heading3"/>
+      </w:pPr>
+    </w:p>
+    <w:p/>
+    <w:p>
+      <w:pPr>
+        <w:pStyle w:val="Heading3"/>
+      </w:pPr>
+    </w:p>
+    <w:p>
+      <w:pPr>
+        <w:pStyle w:val="Heading3"/>
+      </w:pPr>
+      <w:r>
+        <w:t>4.</w:t>
+      </w:r>
+      <w:r>
         <w:t xml:space="preserve">Simple </w:t>
       </w:r>
       <w:proofErr w:type="gramStart"/>
@@ -3617,8 +3832,8 @@
           <w:noProof/>
         </w:rPr>
         <w:drawing>
-          <wp:inline distT="0" distB="0" distL="0" distR="0" wp14:anchorId="56F08ECD" wp14:editId="2819852B">
-            <wp:extent cx="5943600" cy="2216150"/>
+          <wp:inline distT="0" distB="0" distL="0" distR="0" wp14:anchorId="56F08ECD" wp14:editId="2D3537CF">
+            <wp:extent cx="6076950" cy="3333750"/>
             <wp:effectExtent l="0" t="0" r="0" b="0"/>
             <wp:docPr id="2016887068" name="Picture 1"/>
             <wp:cNvGraphicFramePr>
@@ -3640,7 +3855,7 @@
                   <pic:spPr>
                     <a:xfrm>
                       <a:off x="0" y="0"/>
-                      <a:ext cx="5943600" cy="2216150"/>
+                      <a:ext cx="6076950" cy="3333750"/>
                     </a:xfrm>
                     <a:prstGeom prst="rect">
                       <a:avLst/>
@@ -3656,12 +3871,121 @@
     <w:p>
       <w:pPr>
         <w:ind w:left="720"/>
-      </w:pPr>
-      <w:r>
-        <w:rPr>
-          <w:b/>
-          <w:bCs/>
-        </w:rPr>
+        <w:rPr>
+          <w:b/>
+          <w:bCs/>
+        </w:rPr>
+      </w:pPr>
+    </w:p>
+    <w:p>
+      <w:pPr>
+        <w:ind w:left="720"/>
+        <w:rPr>
+          <w:b/>
+          <w:bCs/>
+        </w:rPr>
+      </w:pPr>
+    </w:p>
+    <w:p>
+      <w:pPr>
+        <w:ind w:left="720"/>
+        <w:rPr>
+          <w:b/>
+          <w:bCs/>
+        </w:rPr>
+      </w:pPr>
+    </w:p>
+    <w:p>
+      <w:pPr>
+        <w:ind w:left="720"/>
+        <w:rPr>
+          <w:b/>
+          <w:bCs/>
+        </w:rPr>
+      </w:pPr>
+    </w:p>
+    <w:p>
+      <w:pPr>
+        <w:ind w:left="720"/>
+        <w:rPr>
+          <w:b/>
+          <w:bCs/>
+        </w:rPr>
+      </w:pPr>
+    </w:p>
+    <w:p>
+      <w:pPr>
+        <w:ind w:left="720"/>
+        <w:rPr>
+          <w:b/>
+          <w:bCs/>
+        </w:rPr>
+      </w:pPr>
+    </w:p>
+    <w:p>
+      <w:pPr>
+        <w:ind w:left="720"/>
+        <w:rPr>
+          <w:b/>
+          <w:bCs/>
+        </w:rPr>
+      </w:pPr>
+    </w:p>
+    <w:p>
+      <w:pPr>
+        <w:ind w:left="720"/>
+        <w:rPr>
+          <w:b/>
+          <w:bCs/>
+        </w:rPr>
+      </w:pPr>
+    </w:p>
+    <w:p>
+      <w:pPr>
+        <w:ind w:left="720"/>
+        <w:rPr>
+          <w:b/>
+          <w:bCs/>
+        </w:rPr>
+      </w:pPr>
+    </w:p>
+    <w:p>
+      <w:pPr>
+        <w:ind w:left="720"/>
+        <w:rPr>
+          <w:b/>
+          <w:bCs/>
+        </w:rPr>
+      </w:pPr>
+    </w:p>
+    <w:p>
+      <w:pPr>
+        <w:ind w:left="720"/>
+        <w:rPr>
+          <w:b/>
+          <w:bCs/>
+        </w:rPr>
+      </w:pPr>
+    </w:p>
+    <w:p>
+      <w:pPr>
+        <w:ind w:left="720"/>
+        <w:rPr>
+          <w:b/>
+          <w:bCs/>
+        </w:rPr>
+      </w:pPr>
+    </w:p>
+    <w:p>
+      <w:pPr>
+        <w:ind w:left="720"/>
+      </w:pPr>
+      <w:r>
+        <w:rPr>
+          <w:b/>
+          <w:bCs/>
+        </w:rPr>
+        <w:lastRenderedPageBreak/>
         <w:t>Page B: Output (GUI Screenshot)</w:t>
       </w:r>
     </w:p>
@@ -3669,89 +3993,332 @@
       <w:pPr>
         <w:ind w:left="1440"/>
         <w:jc w:val="center"/>
-      </w:pPr>
-      <w:r>
         <w:rPr>
           <w:noProof/>
         </w:rPr>
+      </w:pPr>
+    </w:p>
+    <w:p>
+      <w:pPr>
+        <w:ind w:left="1440"/>
+        <w:jc w:val="center"/>
+        <w:rPr>
+          <w:noProof/>
+        </w:rPr>
+      </w:pPr>
+      <w:r>
+        <w:rPr>
+          <w:noProof/>
+        </w:rPr>
+        <mc:AlternateContent>
+          <mc:Choice Requires="wps">
+            <w:drawing>
+              <wp:anchor distT="0" distB="0" distL="114300" distR="114300" simplePos="0" relativeHeight="251661312" behindDoc="0" locked="0" layoutInCell="1" allowOverlap="1" wp14:anchorId="6301FAC2" wp14:editId="5C42A930">
+                <wp:simplePos x="0" y="0"/>
+                <wp:positionH relativeFrom="column">
+                  <wp:posOffset>133351</wp:posOffset>
+                </wp:positionH>
+                <wp:positionV relativeFrom="paragraph">
+                  <wp:posOffset>127635</wp:posOffset>
+                </wp:positionV>
+                <wp:extent cx="5657850" cy="3867150"/>
+                <wp:effectExtent l="0" t="0" r="19050" b="19050"/>
+                <wp:wrapNone/>
+                <wp:docPr id="458620139" name="Text Box 3"/>
+                <wp:cNvGraphicFramePr/>
+                <a:graphic xmlns:a="http://schemas.openxmlformats.org/drawingml/2006/main">
+                  <a:graphicData uri="http://schemas.microsoft.com/office/word/2010/wordprocessingShape">
+                    <wps:wsp>
+                      <wps:cNvSpPr txBox="1"/>
+                      <wps:spPr>
+                        <a:xfrm>
+                          <a:off x="0" y="0"/>
+                          <a:ext cx="5657850" cy="3867150"/>
+                        </a:xfrm>
+                        <a:prstGeom prst="rect">
+                          <a:avLst/>
+                        </a:prstGeom>
+                        <a:solidFill>
+                          <a:schemeClr val="lt1"/>
+                        </a:solidFill>
+                        <a:ln w="6350">
+                          <a:solidFill>
+                            <a:prstClr val="black"/>
+                          </a:solidFill>
+                        </a:ln>
+                      </wps:spPr>
+                      <wps:txbx>
+                        <w:txbxContent>
+                          <w:p>
+                            <w:r>
+                              <w:rPr>
+                                <w:noProof/>
+                              </w:rPr>
+                              <w:drawing>
+                                <wp:inline distT="0" distB="0" distL="0" distR="0" wp14:anchorId="7D1A61D0" wp14:editId="29455F43">
+                                  <wp:extent cx="5543550" cy="3819525"/>
+                                  <wp:effectExtent l="0" t="0" r="0" b="9525"/>
+                                  <wp:docPr id="327219432" name="Picture 4"/>
+                                  <wp:cNvGraphicFramePr>
+                                    <a:graphicFrameLocks xmlns:a="http://schemas.openxmlformats.org/drawingml/2006/main" noChangeAspect="1"/>
+                                  </wp:cNvGraphicFramePr>
+                                  <a:graphic xmlns:a="http://schemas.openxmlformats.org/drawingml/2006/main">
+                                    <a:graphicData uri="http://schemas.openxmlformats.org/drawingml/2006/picture">
+                                      <pic:pic xmlns:pic="http://schemas.openxmlformats.org/drawingml/2006/picture">
+                                        <pic:nvPicPr>
+                                          <pic:cNvPr id="0" name="Picture 2"/>
+                                          <pic:cNvPicPr>
+                                            <a:picLocks noChangeAspect="1" noChangeArrowheads="1"/>
+                                          </pic:cNvPicPr>
+                                        </pic:nvPicPr>
+                                        <pic:blipFill>
+                                          <a:blip r:embed="rId18">
+                                            <a:extLst>
+                                              <a:ext uri="{28A0092B-C50C-407E-A947-70E740481C1C}">
+                                                <a14:useLocalDpi xmlns:a14="http://schemas.microsoft.com/office/drawing/2010/main" val="0"/>
+                                              </a:ext>
+                                            </a:extLst>
+                                          </a:blip>
+                                          <a:srcRect/>
+                                          <a:stretch>
+                                            <a:fillRect/>
+                                          </a:stretch>
+                                        </pic:blipFill>
+                                        <pic:spPr bwMode="auto">
+                                          <a:xfrm>
+                                            <a:off x="0" y="0"/>
+                                            <a:ext cx="5543550" cy="3819525"/>
+                                          </a:xfrm>
+                                          <a:prstGeom prst="rect">
+                                            <a:avLst/>
+                                          </a:prstGeom>
+                                          <a:noFill/>
+                                          <a:ln>
+                                            <a:noFill/>
+                                          </a:ln>
+                                        </pic:spPr>
+                                      </pic:pic>
+                                    </a:graphicData>
+                                  </a:graphic>
+                                </wp:inline>
+                              </w:drawing>
+                            </w:r>
+                          </w:p>
+                        </w:txbxContent>
+                      </wps:txbx>
+                      <wps:bodyPr rot="0" spcFirstLastPara="0" vertOverflow="overflow" horzOverflow="overflow" vert="horz" wrap="square" lIns="91440" tIns="45720" rIns="91440" bIns="45720" numCol="1" spcCol="0" rtlCol="0" fromWordArt="0" anchor="t" anchorCtr="0" forceAA="0" compatLnSpc="1">
+                        <a:prstTxWarp prst="textNoShape">
+                          <a:avLst/>
+                        </a:prstTxWarp>
+                        <a:noAutofit/>
+                      </wps:bodyPr>
+                    </wps:wsp>
+                  </a:graphicData>
+                </a:graphic>
+                <wp14:sizeRelH relativeFrom="margin">
+                  <wp14:pctWidth>0</wp14:pctWidth>
+                </wp14:sizeRelH>
+              </wp:anchor>
+            </w:drawing>
+          </mc:Choice>
+          <mc:Fallback>
+            <w:pict>
+              <v:shapetype w14:anchorId="6301FAC2" id="_x0000_t202" coordsize="21600,21600" o:spt="202" path="m,l,21600r21600,l21600,xe">
+                <v:stroke joinstyle="miter"/>
+                <v:path gradientshapeok="t" o:connecttype="rect"/>
+              </v:shapetype>
+              <v:shape id="Text Box 3" o:spid="_x0000_s1026" type="#_x0000_t202" style="position:absolute;left:0;text-align:left;margin-left:10.5pt;margin-top:10.05pt;width:445.5pt;height:304.5pt;z-index:251661312;visibility:visible;mso-wrap-style:square;mso-width-percent:0;mso-wrap-distance-left:9pt;mso-wrap-distance-top:0;mso-wrap-distance-right:9pt;mso-wrap-distance-bottom:0;mso-position-horizontal:absolute;mso-position-horizontal-relative:text;mso-position-vertical:absolute;mso-position-vertical-relative:text;mso-width-percent:0;mso-width-relative:margin;v-text-anchor:top" o:gfxdata="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" fillcolor="white [3201]" strokeweight=".5pt">
+                <v:textbox>
+                  <w:txbxContent>
+                    <w:p>
+                      <w:r>
+                        <w:drawing>
+                          <wp:inline distT="0" distB="0" distL="0" distR="0" wp14:anchorId="7D1A61D0" wp14:editId="29455F43">
+                            <wp:extent cx="5543550" cy="3819525"/>
+                            <wp:effectExtent l="0" t="0" r="0" b="9525"/>
+                            <wp:docPr id="327219432" name="Picture 4"/>
+                            <wp:cNvGraphicFramePr>
+                              <a:graphicFrameLocks xmlns:a="http://schemas.openxmlformats.org/drawingml/2006/main" noChangeAspect="1"/>
+                            </wp:cNvGraphicFramePr>
+                            <a:graphic xmlns:a="http://schemas.openxmlformats.org/drawingml/2006/main">
+                              <a:graphicData uri="http://schemas.openxmlformats.org/drawingml/2006/picture">
+                                <pic:pic xmlns:pic="http://schemas.openxmlformats.org/drawingml/2006/picture">
+                                  <pic:nvPicPr>
+                                    <pic:cNvPr id="0" name="Picture 2"/>
+                                    <pic:cNvPicPr>
+                                      <a:picLocks noChangeAspect="1" noChangeArrowheads="1"/>
+                                    </pic:cNvPicPr>
+                                  </pic:nvPicPr>
+                                  <pic:blipFill>
+                                    <a:blip r:embed="rId19">
+                                      <a:extLst>
+                                        <a:ext uri="{28A0092B-C50C-407E-A947-70E740481C1C}">
+                                          <a14:useLocalDpi xmlns:a14="http://schemas.microsoft.com/office/drawing/2010/main" val="0"/>
+                                        </a:ext>
+                                      </a:extLst>
+                                    </a:blip>
+                                    <a:srcRect/>
+                                    <a:stretch>
+                                      <a:fillRect/>
+                                    </a:stretch>
+                                  </pic:blipFill>
+                                  <pic:spPr bwMode="auto">
+                                    <a:xfrm>
+                                      <a:off x="0" y="0"/>
+                                      <a:ext cx="5543550" cy="3819525"/>
+                                    </a:xfrm>
+                                    <a:prstGeom prst="rect">
+                                      <a:avLst/>
+                                    </a:prstGeom>
+                                    <a:noFill/>
+                                    <a:ln>
+                                      <a:noFill/>
+                                    </a:ln>
+                                  </pic:spPr>
+                                </pic:pic>
+                              </a:graphicData>
+                            </a:graphic>
+                          </wp:inline>
+                        </w:drawing>
+                      </w:r>
+                    </w:p>
+                  </w:txbxContent>
+                </v:textbox>
+              </v:shape>
+            </w:pict>
+          </mc:Fallback>
+        </mc:AlternateContent>
+      </w:r>
+    </w:p>
+    <w:p>
+      <w:pPr>
+        <w:ind w:left="1440"/>
+        <w:jc w:val="center"/>
+        <w:rPr>
+          <w:noProof/>
+        </w:rPr>
+      </w:pPr>
+    </w:p>
+    <w:p>
+      <w:pPr>
+        <w:ind w:left="1440"/>
+        <w:jc w:val="center"/>
+        <w:rPr>
+          <w:noProof/>
+        </w:rPr>
+      </w:pPr>
+    </w:p>
+    <w:p>
+      <w:pPr>
+        <w:ind w:left="1440"/>
+        <w:jc w:val="center"/>
+        <w:rPr>
+          <w:noProof/>
+        </w:rPr>
+      </w:pPr>
+    </w:p>
+    <w:p>
+      <w:pPr>
+        <w:ind w:left="1440"/>
+        <w:jc w:val="center"/>
+        <w:rPr>
+          <w:noProof/>
+        </w:rPr>
+      </w:pPr>
+    </w:p>
+    <w:p>
+      <w:pPr>
+        <w:ind w:left="1440"/>
+        <w:jc w:val="center"/>
+        <w:rPr>
+          <w:noProof/>
+        </w:rPr>
+      </w:pPr>
+    </w:p>
+    <w:p>
+      <w:pPr>
+        <w:ind w:left="1440"/>
+        <w:jc w:val="center"/>
+        <w:rPr>
+          <w:noProof/>
+        </w:rPr>
+      </w:pPr>
+    </w:p>
+    <w:p>
+      <w:pPr>
+        <w:ind w:left="1440"/>
+        <w:jc w:val="center"/>
+        <w:rPr>
+          <w:noProof/>
+        </w:rPr>
+      </w:pPr>
+    </w:p>
+    <w:p>
+      <w:pPr>
+        <w:ind w:left="1440"/>
+        <w:jc w:val="center"/>
+        <w:rPr>
+          <w:noProof/>
+        </w:rPr>
+      </w:pPr>
+    </w:p>
+    <w:p>
+      <w:pPr>
+        <w:ind w:left="1440"/>
+        <w:jc w:val="center"/>
+      </w:pPr>
+    </w:p>
+    <w:p>
+      <w:pPr>
+        <w:ind w:left="1440"/>
+      </w:pPr>
+    </w:p>
+    <w:p>
+      <w:pPr>
+        <w:pStyle w:val="Heading3"/>
+        <w:ind w:left="0"/>
+      </w:pPr>
+      <w:bookmarkStart w:id="16" w:name="_Toc221898864"/>
+    </w:p>
+    <w:p>
+      <w:pPr>
+        <w:pStyle w:val="Heading3"/>
+        <w:ind w:left="0"/>
+      </w:pPr>
+      <w:r>
+        <w:t>5.</w:t>
+      </w:r>
+      <w:r>
+        <w:t>Secant</w:t>
+      </w:r>
+      <w:r>
+        <w:t xml:space="preserve"> </w:t>
+      </w:r>
+      <w:r>
+        <w:t>Method</w:t>
+      </w:r>
+      <w:bookmarkEnd w:id="16"/>
+    </w:p>
+    <w:p>
+      <w:pPr>
+        <w:ind w:left="720"/>
+        <w:jc w:val="center"/>
+      </w:pPr>
+      <w:r>
+        <w:rPr>
+          <w:b/>
+          <w:bCs/>
+        </w:rPr>
+        <w:t>Page A: Code Snippet</w:t>
+      </w:r>
+      <w:r>
+        <w:rPr>
+          <w:noProof/>
+        </w:rPr>
         <w:drawing>
-          <wp:inline distT="0" distB="0" distL="0" distR="0" wp14:anchorId="5F4EB71F" wp14:editId="3F988F8C">
-            <wp:extent cx="5524500" cy="1942465"/>
-            <wp:effectExtent l="0" t="0" r="0" b="635"/>
-            <wp:docPr id="1147367644" name="Picture 1"/>
-            <wp:cNvGraphicFramePr>
-              <a:graphicFrameLocks xmlns:a="http://schemas.openxmlformats.org/drawingml/2006/main" noChangeAspect="1"/>
-            </wp:cNvGraphicFramePr>
-            <a:graphic xmlns:a="http://schemas.openxmlformats.org/drawingml/2006/main">
-              <a:graphicData uri="http://schemas.openxmlformats.org/drawingml/2006/picture">
-                <pic:pic xmlns:pic="http://schemas.openxmlformats.org/drawingml/2006/picture">
-                  <pic:nvPicPr>
-                    <pic:cNvPr id="1147367644" name=""/>
-                    <pic:cNvPicPr/>
-                  </pic:nvPicPr>
-                  <pic:blipFill>
-                    <a:blip r:embed="rId18"/>
-                    <a:stretch>
-                      <a:fillRect/>
-                    </a:stretch>
-                  </pic:blipFill>
-                  <pic:spPr>
-                    <a:xfrm>
-                      <a:off x="0" y="0"/>
-                      <a:ext cx="5524500" cy="1942465"/>
-                    </a:xfrm>
-                    <a:prstGeom prst="rect">
-                      <a:avLst/>
-                    </a:prstGeom>
-                  </pic:spPr>
-                </pic:pic>
-              </a:graphicData>
-            </a:graphic>
-          </wp:inline>
-        </w:drawing>
-      </w:r>
-    </w:p>
-    <w:p>
-      <w:pPr>
-        <w:ind w:left="1440"/>
-      </w:pPr>
-    </w:p>
-    <w:p>
-      <w:pPr>
-        <w:pStyle w:val="Heading3"/>
-      </w:pPr>
-      <w:bookmarkStart w:id="16" w:name="_Toc221898864"/>
-      <w:r>
-        <w:lastRenderedPageBreak/>
-        <w:t>Secant</w:t>
-      </w:r>
-      <w:r>
-        <w:t xml:space="preserve"> </w:t>
-      </w:r>
-      <w:r>
-        <w:t>Method</w:t>
-      </w:r>
-      <w:bookmarkEnd w:id="16"/>
-    </w:p>
-    <w:p>
-      <w:pPr>
-        <w:ind w:left="720"/>
-      </w:pPr>
-      <w:r>
-        <w:rPr>
-          <w:b/>
-          <w:bCs/>
-        </w:rPr>
-        <w:t>Page A: Code Snippet</w:t>
-      </w:r>
-      <w:r>
-        <w:rPr>
-          <w:noProof/>
-        </w:rPr>
-        <w:drawing>
-          <wp:inline distT="0" distB="0" distL="0" distR="0" wp14:anchorId="1E37E080" wp14:editId="55ACA1A4">
-            <wp:extent cx="5943600" cy="3075940"/>
-            <wp:effectExtent l="0" t="0" r="0" b="0"/>
+          <wp:inline distT="0" distB="0" distL="0" distR="0" wp14:anchorId="1E37E080" wp14:editId="55F79571">
+            <wp:extent cx="6086475" cy="3743325"/>
+            <wp:effectExtent l="0" t="0" r="9525" b="9525"/>
             <wp:docPr id="425257670" name="Picture 1"/>
             <wp:cNvGraphicFramePr>
               <a:graphicFrameLocks xmlns:a="http://schemas.openxmlformats.org/drawingml/2006/main" noChangeAspect="1"/>
@@ -3764,7 +4331,7 @@
                     <pic:cNvPicPr/>
                   </pic:nvPicPr>
                   <pic:blipFill>
-                    <a:blip r:embed="rId19"/>
+                    <a:blip r:embed="rId20"/>
                     <a:stretch>
                       <a:fillRect/>
                     </a:stretch>
@@ -3772,7 +4339,7 @@
                   <pic:spPr>
                     <a:xfrm>
                       <a:off x="0" y="0"/>
-                      <a:ext cx="5943600" cy="3075940"/>
+                      <a:ext cx="6086475" cy="3743325"/>
                     </a:xfrm>
                     <a:prstGeom prst="rect">
                       <a:avLst/>
@@ -3788,12 +4355,112 @@
     <w:p>
       <w:pPr>
         <w:ind w:left="720"/>
-      </w:pPr>
-      <w:r>
-        <w:rPr>
-          <w:b/>
-          <w:bCs/>
-        </w:rPr>
+        <w:rPr>
+          <w:b/>
+          <w:bCs/>
+        </w:rPr>
+      </w:pPr>
+    </w:p>
+    <w:p>
+      <w:pPr>
+        <w:ind w:left="720"/>
+        <w:rPr>
+          <w:b/>
+          <w:bCs/>
+        </w:rPr>
+      </w:pPr>
+    </w:p>
+    <w:p>
+      <w:pPr>
+        <w:ind w:left="720"/>
+        <w:rPr>
+          <w:b/>
+          <w:bCs/>
+        </w:rPr>
+      </w:pPr>
+    </w:p>
+    <w:p>
+      <w:pPr>
+        <w:ind w:left="720"/>
+        <w:rPr>
+          <w:b/>
+          <w:bCs/>
+        </w:rPr>
+      </w:pPr>
+    </w:p>
+    <w:p>
+      <w:pPr>
+        <w:ind w:left="720"/>
+        <w:rPr>
+          <w:b/>
+          <w:bCs/>
+        </w:rPr>
+      </w:pPr>
+    </w:p>
+    <w:p>
+      <w:pPr>
+        <w:ind w:left="720"/>
+        <w:rPr>
+          <w:b/>
+          <w:bCs/>
+        </w:rPr>
+      </w:pPr>
+    </w:p>
+    <w:p>
+      <w:pPr>
+        <w:ind w:left="720"/>
+        <w:rPr>
+          <w:b/>
+          <w:bCs/>
+        </w:rPr>
+      </w:pPr>
+    </w:p>
+    <w:p>
+      <w:pPr>
+        <w:ind w:left="720"/>
+        <w:rPr>
+          <w:b/>
+          <w:bCs/>
+        </w:rPr>
+      </w:pPr>
+    </w:p>
+    <w:p>
+      <w:pPr>
+        <w:ind w:left="720"/>
+        <w:rPr>
+          <w:b/>
+          <w:bCs/>
+        </w:rPr>
+      </w:pPr>
+    </w:p>
+    <w:p>
+      <w:pPr>
+        <w:ind w:left="720"/>
+        <w:rPr>
+          <w:b/>
+          <w:bCs/>
+        </w:rPr>
+      </w:pPr>
+    </w:p>
+    <w:p>
+      <w:pPr>
+        <w:ind w:left="720"/>
+        <w:rPr>
+          <w:b/>
+          <w:bCs/>
+        </w:rPr>
+      </w:pPr>
+    </w:p>
+    <w:p>
+      <w:pPr>
+        <w:ind w:left="720"/>
+      </w:pPr>
+      <w:r>
+        <w:rPr>
+          <w:b/>
+          <w:bCs/>
+        </w:rPr>
+        <w:lastRenderedPageBreak/>
         <w:t>Page B: Output (GUI Screenshot)</w:t>
       </w:r>
     </w:p>
@@ -3805,16 +4472,287 @@
     <w:p>
       <w:pPr>
         <w:ind w:left="1440"/>
+        <w:jc w:val="center"/>
       </w:pPr>
       <w:r>
         <w:rPr>
           <w:noProof/>
         </w:rPr>
+        <mc:AlternateContent>
+          <mc:Choice Requires="wps">
+            <w:drawing>
+              <wp:anchor distT="0" distB="0" distL="114300" distR="114300" simplePos="0" relativeHeight="251660288" behindDoc="0" locked="0" layoutInCell="1" allowOverlap="1" wp14:anchorId="206C3900" wp14:editId="16472C87">
+                <wp:simplePos x="0" y="0"/>
+                <wp:positionH relativeFrom="column">
+                  <wp:posOffset>-76200</wp:posOffset>
+                </wp:positionH>
+                <wp:positionV relativeFrom="paragraph">
+                  <wp:posOffset>108585</wp:posOffset>
+                </wp:positionV>
+                <wp:extent cx="6048375" cy="3514725"/>
+                <wp:effectExtent l="0" t="0" r="28575" b="28575"/>
+                <wp:wrapNone/>
+                <wp:docPr id="248692897" name="Text Box 1"/>
+                <wp:cNvGraphicFramePr/>
+                <a:graphic xmlns:a="http://schemas.openxmlformats.org/drawingml/2006/main">
+                  <a:graphicData uri="http://schemas.microsoft.com/office/word/2010/wordprocessingShape">
+                    <wps:wsp>
+                      <wps:cNvSpPr txBox="1"/>
+                      <wps:spPr>
+                        <a:xfrm>
+                          <a:off x="0" y="0"/>
+                          <a:ext cx="6048375" cy="3514725"/>
+                        </a:xfrm>
+                        <a:prstGeom prst="rect">
+                          <a:avLst/>
+                        </a:prstGeom>
+                        <a:solidFill>
+                          <a:schemeClr val="lt1"/>
+                        </a:solidFill>
+                        <a:ln w="6350">
+                          <a:solidFill>
+                            <a:prstClr val="black"/>
+                          </a:solidFill>
+                        </a:ln>
+                      </wps:spPr>
+                      <wps:txbx>
+                        <w:txbxContent>
+                          <w:p>
+                            <w:r>
+                              <w:rPr>
+                                <w:noProof/>
+                              </w:rPr>
+                              <w:drawing>
+                                <wp:inline distT="0" distB="0" distL="0" distR="0" wp14:anchorId="291700AB" wp14:editId="513572CA">
+                                  <wp:extent cx="5895975" cy="3581400"/>
+                                  <wp:effectExtent l="0" t="0" r="9525" b="0"/>
+                                  <wp:docPr id="986846308" name="Picture 2"/>
+                                  <wp:cNvGraphicFramePr>
+                                    <a:graphicFrameLocks xmlns:a="http://schemas.openxmlformats.org/drawingml/2006/main" noChangeAspect="1"/>
+                                  </wp:cNvGraphicFramePr>
+                                  <a:graphic xmlns:a="http://schemas.openxmlformats.org/drawingml/2006/main">
+                                    <a:graphicData uri="http://schemas.openxmlformats.org/drawingml/2006/picture">
+                                      <pic:pic xmlns:pic="http://schemas.openxmlformats.org/drawingml/2006/picture">
+                                        <pic:nvPicPr>
+                                          <pic:cNvPr id="0" name="Picture 1"/>
+                                          <pic:cNvPicPr>
+                                            <a:picLocks noChangeAspect="1" noChangeArrowheads="1"/>
+                                          </pic:cNvPicPr>
+                                        </pic:nvPicPr>
+                                        <pic:blipFill>
+                                          <a:blip r:embed="rId21">
+                                            <a:extLst>
+                                              <a:ext uri="{28A0092B-C50C-407E-A947-70E740481C1C}">
+                                                <a14:useLocalDpi xmlns:a14="http://schemas.microsoft.com/office/drawing/2010/main" val="0"/>
+                                              </a:ext>
+                                            </a:extLst>
+                                          </a:blip>
+                                          <a:srcRect/>
+                                          <a:stretch>
+                                            <a:fillRect/>
+                                          </a:stretch>
+                                        </pic:blipFill>
+                                        <pic:spPr bwMode="auto">
+                                          <a:xfrm>
+                                            <a:off x="0" y="0"/>
+                                            <a:ext cx="5895975" cy="3581400"/>
+                                          </a:xfrm>
+                                          <a:prstGeom prst="rect">
+                                            <a:avLst/>
+                                          </a:prstGeom>
+                                          <a:noFill/>
+                                          <a:ln>
+                                            <a:noFill/>
+                                          </a:ln>
+                                        </pic:spPr>
+                                      </pic:pic>
+                                    </a:graphicData>
+                                  </a:graphic>
+                                </wp:inline>
+                              </w:drawing>
+                            </w:r>
+                          </w:p>
+                        </w:txbxContent>
+                      </wps:txbx>
+                      <wps:bodyPr rot="0" spcFirstLastPara="0" vertOverflow="overflow" horzOverflow="overflow" vert="horz" wrap="square" lIns="91440" tIns="45720" rIns="91440" bIns="45720" numCol="1" spcCol="0" rtlCol="0" fromWordArt="0" anchor="t" anchorCtr="0" forceAA="0" compatLnSpc="1">
+                        <a:prstTxWarp prst="textNoShape">
+                          <a:avLst/>
+                        </a:prstTxWarp>
+                        <a:noAutofit/>
+                      </wps:bodyPr>
+                    </wps:wsp>
+                  </a:graphicData>
+                </a:graphic>
+              </wp:anchor>
+            </w:drawing>
+          </mc:Choice>
+          <mc:Fallback>
+            <w:pict>
+              <v:shape w14:anchorId="206C3900" id="Text Box 1" o:spid="_x0000_s1027" type="#_x0000_t202" style="position:absolute;left:0;text-align:left;margin-left:-6pt;margin-top:8.55pt;width:476.25pt;height:276.75pt;z-index:251660288;visibility:visible;mso-wrap-style:square;mso-wrap-distance-left:9pt;mso-wrap-distance-top:0;mso-wrap-distance-right:9pt;mso-wrap-distance-bottom:0;mso-position-horizontal:absolute;mso-position-horizontal-relative:text;mso-position-vertical:absolute;mso-position-vertical-relative:text;v-text-anchor:top" o:gfxdata="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" fillcolor="white [3201]" strokeweight=".5pt">
+                <v:textbox>
+                  <w:txbxContent>
+                    <w:p>
+                      <w:r>
+                        <w:drawing>
+                          <wp:inline distT="0" distB="0" distL="0" distR="0" wp14:anchorId="291700AB" wp14:editId="513572CA">
+                            <wp:extent cx="5895975" cy="3581400"/>
+                            <wp:effectExtent l="0" t="0" r="9525" b="0"/>
+                            <wp:docPr id="986846308" name="Picture 2"/>
+                            <wp:cNvGraphicFramePr>
+                              <a:graphicFrameLocks xmlns:a="http://schemas.openxmlformats.org/drawingml/2006/main" noChangeAspect="1"/>
+                            </wp:cNvGraphicFramePr>
+                            <a:graphic xmlns:a="http://schemas.openxmlformats.org/drawingml/2006/main">
+                              <a:graphicData uri="http://schemas.openxmlformats.org/drawingml/2006/picture">
+                                <pic:pic xmlns:pic="http://schemas.openxmlformats.org/drawingml/2006/picture">
+                                  <pic:nvPicPr>
+                                    <pic:cNvPr id="0" name="Picture 1"/>
+                                    <pic:cNvPicPr>
+                                      <a:picLocks noChangeAspect="1" noChangeArrowheads="1"/>
+                                    </pic:cNvPicPr>
+                                  </pic:nvPicPr>
+                                  <pic:blipFill>
+                                    <a:blip r:embed="rId22">
+                                      <a:extLst>
+                                        <a:ext uri="{28A0092B-C50C-407E-A947-70E740481C1C}">
+                                          <a14:useLocalDpi xmlns:a14="http://schemas.microsoft.com/office/drawing/2010/main" val="0"/>
+                                        </a:ext>
+                                      </a:extLst>
+                                    </a:blip>
+                                    <a:srcRect/>
+                                    <a:stretch>
+                                      <a:fillRect/>
+                                    </a:stretch>
+                                  </pic:blipFill>
+                                  <pic:spPr bwMode="auto">
+                                    <a:xfrm>
+                                      <a:off x="0" y="0"/>
+                                      <a:ext cx="5895975" cy="3581400"/>
+                                    </a:xfrm>
+                                    <a:prstGeom prst="rect">
+                                      <a:avLst/>
+                                    </a:prstGeom>
+                                    <a:noFill/>
+                                    <a:ln>
+                                      <a:noFill/>
+                                    </a:ln>
+                                  </pic:spPr>
+                                </pic:pic>
+                              </a:graphicData>
+                            </a:graphic>
+                          </wp:inline>
+                        </w:drawing>
+                      </w:r>
+                    </w:p>
+                  </w:txbxContent>
+                </v:textbox>
+              </v:shape>
+            </w:pict>
+          </mc:Fallback>
+        </mc:AlternateContent>
+      </w:r>
+    </w:p>
+    <w:p>
+      <w:pPr>
+        <w:ind w:left="1440"/>
+        <w:jc w:val="center"/>
+      </w:pPr>
+    </w:p>
+    <w:p>
+      <w:pPr>
+        <w:ind w:left="1440"/>
+        <w:jc w:val="center"/>
+      </w:pPr>
+    </w:p>
+    <w:p>
+      <w:pPr>
+        <w:ind w:left="1440"/>
+      </w:pPr>
+    </w:p>
+    <w:p>
+      <w:pPr>
+        <w:pStyle w:val="Heading2"/>
+        <w:numPr>
+          <w:ilvl w:val="0"/>
+          <w:numId w:val="0"/>
+        </w:numPr>
+        <w:ind w:left="720"/>
+      </w:pPr>
+      <w:bookmarkStart w:id="17" w:name="_Toc221898865"/>
+      <w:r>
+        <w:lastRenderedPageBreak/>
+        <w:t xml:space="preserve">Chapter </w:t>
+      </w:r>
+      <w:proofErr w:type="gramStart"/>
+      <w:r>
+        <w:t>2 :</w:t>
+      </w:r>
+      <w:proofErr w:type="gramEnd"/>
+      <w:r>
+        <w:t xml:space="preserve"> </w:t>
+      </w:r>
+      <w:r>
+        <w:t>LINEAR ALGEBRAIC EQUATIONS</w:t>
+      </w:r>
+      <w:bookmarkEnd w:id="17"/>
+    </w:p>
+    <w:p>
+      <w:pPr>
+        <w:pStyle w:val="Heading3"/>
+        <w:ind w:left="0"/>
+      </w:pPr>
+      <w:bookmarkStart w:id="18" w:name="_Toc221898866"/>
+      <w:r>
+        <w:t>1.</w:t>
+      </w:r>
+      <w:r>
+        <w:t>Gauss Elimination</w:t>
+      </w:r>
+      <w:bookmarkEnd w:id="18"/>
+    </w:p>
+    <w:p>
+      <w:pPr>
+        <w:pStyle w:val="Heading3"/>
+        <w:ind w:left="0"/>
+      </w:pPr>
+      <w:r>
+        <w:t xml:space="preserve"> </w:t>
+      </w:r>
+      <w:r>
+        <w:t>Page A: Code Snippet</w:t>
+      </w:r>
+    </w:p>
+    <w:p>
+      <w:pPr>
+        <w:pStyle w:val="Heading3"/>
+        <w:ind w:left="0"/>
+        <w:rPr>
+          <w:noProof/>
+        </w:rPr>
+      </w:pPr>
+    </w:p>
+    <w:p>
+      <w:pPr>
+        <w:pStyle w:val="Heading3"/>
+        <w:ind w:left="0"/>
+        <w:rPr>
+          <w:noProof/>
+        </w:rPr>
+      </w:pPr>
+    </w:p>
+    <w:p>
+      <w:pPr>
+        <w:pStyle w:val="Heading3"/>
+        <w:ind w:left="0"/>
+      </w:pPr>
+      <w:r>
+        <w:rPr>
+          <w:noProof/>
+        </w:rPr>
         <w:drawing>
-          <wp:inline distT="0" distB="0" distL="0" distR="0" wp14:anchorId="69431D5B" wp14:editId="42E580D0">
-            <wp:extent cx="5943600" cy="2867692"/>
-            <wp:effectExtent l="0" t="0" r="0" b="8890"/>
-            <wp:docPr id="2068917291" name="Picture 1"/>
+          <wp:inline distT="0" distB="0" distL="0" distR="0" wp14:anchorId="30EDC74A" wp14:editId="03F59340">
+            <wp:extent cx="5943600" cy="4305300"/>
+            <wp:effectExtent l="0" t="0" r="0" b="0"/>
+            <wp:docPr id="691553574" name="Picture 1"/>
             <wp:cNvGraphicFramePr>
               <a:graphicFrameLocks xmlns:a="http://schemas.openxmlformats.org/drawingml/2006/main" noChangeAspect="1"/>
             </wp:cNvGraphicFramePr>
@@ -3822,11 +4760,11 @@
               <a:graphicData uri="http://schemas.openxmlformats.org/drawingml/2006/picture">
                 <pic:pic xmlns:pic="http://schemas.openxmlformats.org/drawingml/2006/picture">
                   <pic:nvPicPr>
-                    <pic:cNvPr id="2068917291" name=""/>
+                    <pic:cNvPr id="691553574" name=""/>
                     <pic:cNvPicPr/>
                   </pic:nvPicPr>
                   <pic:blipFill>
-                    <a:blip r:embed="rId20"/>
+                    <a:blip r:embed="rId23"/>
                     <a:stretch>
                       <a:fillRect/>
                     </a:stretch>
@@ -3834,7 +4772,7 @@
                   <pic:spPr>
                     <a:xfrm>
                       <a:off x="0" y="0"/>
-                      <a:ext cx="5943600" cy="2867692"/>
+                      <a:ext cx="5943600" cy="4305300"/>
                     </a:xfrm>
                     <a:prstGeom prst="rect">
                       <a:avLst/>
@@ -3847,117 +4785,7 @@
         </w:drawing>
       </w:r>
     </w:p>
-    <w:p>
-      <w:pPr>
-        <w:ind w:left="1440"/>
-      </w:pPr>
-    </w:p>
-    <w:p>
-      <w:pPr>
-        <w:ind w:left="1440"/>
-      </w:pPr>
-    </w:p>
-    <w:p>
-      <w:pPr>
-        <w:ind w:left="1440"/>
-      </w:pPr>
-    </w:p>
-    <w:p>
-      <w:pPr>
-        <w:pStyle w:val="Heading2"/>
-        <w:numPr>
-          <w:ilvl w:val="0"/>
-          <w:numId w:val="0"/>
-        </w:numPr>
-        <w:ind w:left="720"/>
-      </w:pPr>
-      <w:bookmarkStart w:id="17" w:name="_Toc221898865"/>
-      <w:r>
-        <w:lastRenderedPageBreak/>
-        <w:t xml:space="preserve">Chapter </w:t>
-      </w:r>
-      <w:proofErr w:type="gramStart"/>
-      <w:r>
-        <w:t>2 :</w:t>
-      </w:r>
-      <w:proofErr w:type="gramEnd"/>
-      <w:r>
-        <w:t xml:space="preserve"> </w:t>
-      </w:r>
-      <w:r>
-        <w:t>LINEAR ALGEBRAIC EQUATIONS</w:t>
-      </w:r>
-      <w:bookmarkEnd w:id="17"/>
-    </w:p>
-    <w:p>
-      <w:pPr>
-        <w:pStyle w:val="Heading3"/>
-        <w:numPr>
-          <w:ilvl w:val="0"/>
-          <w:numId w:val="14"/>
-        </w:numPr>
-      </w:pPr>
-      <w:bookmarkStart w:id="18" w:name="_Toc221898866"/>
-      <w:r>
-        <w:t>Gauss Elimination</w:t>
-      </w:r>
-      <w:bookmarkEnd w:id="18"/>
-      <w:r>
-        <w:t xml:space="preserve"> </w:t>
-      </w:r>
-    </w:p>
-    <w:p>
-      <w:pPr>
-        <w:ind w:left="720"/>
-      </w:pPr>
-      <w:r>
-        <w:rPr>
-          <w:b/>
-          <w:bCs/>
-        </w:rPr>
-        <w:t>Page A: Code Snippet</w:t>
-      </w:r>
-      <w:r>
-        <w:rPr>
-          <w:noProof/>
-        </w:rPr>
-        <w:drawing>
-          <wp:inline distT="0" distB="0" distL="0" distR="0" wp14:anchorId="74512E42" wp14:editId="1EF0E70B">
-            <wp:extent cx="5943600" cy="5627370"/>
-            <wp:effectExtent l="0" t="0" r="0" b="0"/>
-            <wp:docPr id="2068306172" name="Picture 1"/>
-            <wp:cNvGraphicFramePr>
-              <a:graphicFrameLocks xmlns:a="http://schemas.openxmlformats.org/drawingml/2006/main" noChangeAspect="1"/>
-            </wp:cNvGraphicFramePr>
-            <a:graphic xmlns:a="http://schemas.openxmlformats.org/drawingml/2006/main">
-              <a:graphicData uri="http://schemas.openxmlformats.org/drawingml/2006/picture">
-                <pic:pic xmlns:pic="http://schemas.openxmlformats.org/drawingml/2006/picture">
-                  <pic:nvPicPr>
-                    <pic:cNvPr id="2068306172" name=""/>
-                    <pic:cNvPicPr/>
-                  </pic:nvPicPr>
-                  <pic:blipFill>
-                    <a:blip r:embed="rId21"/>
-                    <a:stretch>
-                      <a:fillRect/>
-                    </a:stretch>
-                  </pic:blipFill>
-                  <pic:spPr>
-                    <a:xfrm>
-                      <a:off x="0" y="0"/>
-                      <a:ext cx="5943600" cy="5627370"/>
-                    </a:xfrm>
-                    <a:prstGeom prst="rect">
-                      <a:avLst/>
-                    </a:prstGeom>
-                  </pic:spPr>
-                </pic:pic>
-              </a:graphicData>
-            </a:graphic>
-          </wp:inline>
-        </w:drawing>
-      </w:r>
-    </w:p>
+    <w:p/>
     <w:p>
       <w:pPr>
         <w:ind w:left="720"/>
@@ -3996,7 +4824,7 @@
                     <pic:cNvPicPr/>
                   </pic:nvPicPr>
                   <pic:blipFill>
-                    <a:blip r:embed="rId22"/>
+                    <a:blip r:embed="rId24"/>
                     <a:stretch>
                       <a:fillRect/>
                     </a:stretch>
@@ -4030,28 +4858,33 @@
     <w:p>
       <w:pPr>
         <w:pStyle w:val="Heading3"/>
+        <w:ind w:left="0"/>
         <w:rPr>
           <w:rtl/>
         </w:rPr>
       </w:pPr>
       <w:bookmarkStart w:id="19" w:name="_Toc221898867"/>
-      <w:proofErr w:type="spellStart"/>
       <w:r>
         <w:lastRenderedPageBreak/>
+        <w:t>2.</w:t>
+      </w:r>
+      <w:r>
         <w:t>LUDecomposition</w:t>
       </w:r>
       <w:bookmarkEnd w:id="19"/>
-      <w:proofErr w:type="spellEnd"/>
       <w:r>
         <w:t xml:space="preserve"> </w:t>
       </w:r>
     </w:p>
     <w:p>
       <w:r>
+        <w:rPr>
+          <w:noProof/>
+        </w:rPr>
         <w:drawing>
-          <wp:inline distT="0" distB="0" distL="0" distR="0" wp14:anchorId="240B9DA8" wp14:editId="4751A069">
-            <wp:extent cx="6153150" cy="5324475"/>
-            <wp:effectExtent l="0" t="0" r="0" b="9525"/>
+          <wp:inline distT="0" distB="0" distL="0" distR="0" wp14:anchorId="3B829568" wp14:editId="388A8EE0">
+            <wp:extent cx="5943600" cy="4865901"/>
+            <wp:effectExtent l="0" t="0" r="0" b="0"/>
             <wp:docPr id="1154655694" name="Picture 6"/>
             <wp:cNvGraphicFramePr>
               <a:graphicFrameLocks xmlns:a="http://schemas.openxmlformats.org/drawingml/2006/main" noChangeAspect="1"/>
@@ -4066,7 +4899,7 @@
                     </pic:cNvPicPr>
                   </pic:nvPicPr>
                   <pic:blipFill>
-                    <a:blip r:embed="rId23">
+                    <a:blip r:embed="rId25">
                       <a:extLst>
                         <a:ext uri="{28A0092B-C50C-407E-A947-70E740481C1C}">
                           <a14:useLocalDpi xmlns:a14="http://schemas.microsoft.com/office/drawing/2010/main" val="0"/>
@@ -4081,7 +4914,7 @@
                   <pic:spPr bwMode="auto">
                     <a:xfrm>
                       <a:off x="0" y="0"/>
-                      <a:ext cx="6153150" cy="5324475"/>
+                      <a:ext cx="5943600" cy="4865901"/>
                     </a:xfrm>
                     <a:prstGeom prst="rect">
                       <a:avLst/>
@@ -4097,34 +4930,14 @@
           </wp:inline>
         </w:drawing>
       </w:r>
-    </w:p>
-    <w:p>
-      <w:pPr>
-        <w:pStyle w:val="Heading3"/>
-        <w:numPr>
-          <w:ilvl w:val="0"/>
-          <w:numId w:val="0"/>
-        </w:numPr>
-        <w:ind w:left="3150"/>
-      </w:pPr>
-    </w:p>
-    <w:p>
-      <w:pPr>
-        <w:pStyle w:val="Heading3"/>
-        <w:numPr>
-          <w:ilvl w:val="0"/>
-          <w:numId w:val="0"/>
-        </w:numPr>
-        <w:ind w:left="1350"/>
-      </w:pPr>
       <w:r>
         <w:rPr>
           <w:noProof/>
         </w:rPr>
         <w:drawing>
-          <wp:inline distT="0" distB="0" distL="0" distR="0" wp14:anchorId="3291C71F" wp14:editId="68305F6E">
-            <wp:extent cx="4686300" cy="3648075"/>
-            <wp:effectExtent l="0" t="0" r="0" b="9525"/>
+          <wp:inline distT="0" distB="0" distL="0" distR="0" wp14:anchorId="57416976" wp14:editId="0377AC10">
+            <wp:extent cx="4684941" cy="2475781"/>
+            <wp:effectExtent l="0" t="0" r="1905" b="1270"/>
             <wp:docPr id="597501575" name="Picture 1"/>
             <wp:cNvGraphicFramePr>
               <a:graphicFrameLocks xmlns:a="http://schemas.openxmlformats.org/drawingml/2006/main" noChangeAspect="1"/>
@@ -4137,7 +4950,7 @@
                     <pic:cNvPicPr/>
                   </pic:nvPicPr>
                   <pic:blipFill>
-                    <a:blip r:embed="rId24"/>
+                    <a:blip r:embed="rId26"/>
                     <a:stretch>
                       <a:fillRect/>
                     </a:stretch>
@@ -4145,7 +4958,7 @@
                   <pic:spPr>
                     <a:xfrm>
                       <a:off x="0" y="0"/>
-                      <a:ext cx="4686300" cy="3648075"/>
+                      <a:ext cx="4694632" cy="2480902"/>
                     </a:xfrm>
                     <a:prstGeom prst="rect">
                       <a:avLst/>
@@ -4157,6 +4970,16 @@
           </wp:inline>
         </w:drawing>
       </w:r>
+    </w:p>
+    <w:p>
+      <w:pPr>
+        <w:pStyle w:val="Heading3"/>
+      </w:pPr>
+    </w:p>
+    <w:p>
+      <w:pPr>
+        <w:pStyle w:val="Heading3"/>
+      </w:pPr>
     </w:p>
     <w:p>
       <w:r>
@@ -4179,7 +5002,7 @@
                     <pic:cNvPicPr/>
                   </pic:nvPicPr>
                   <pic:blipFill>
-                    <a:blip r:embed="rId25"/>
+                    <a:blip r:embed="rId27"/>
                     <a:stretch>
                       <a:fillRect/>
                     </a:stretch>
@@ -4204,10 +5027,14 @@
     <w:p>
       <w:pPr>
         <w:pStyle w:val="Heading3"/>
+        <w:ind w:left="0"/>
       </w:pPr>
       <w:bookmarkStart w:id="20" w:name="_Toc221898868"/>
       <w:r>
         <w:lastRenderedPageBreak/>
+        <w:t>3.</w:t>
+      </w:r>
+      <w:r>
         <w:t>Cramer’s Rule</w:t>
       </w:r>
       <w:bookmarkEnd w:id="20"/>
@@ -4246,7 +5073,7 @@
                     <pic:cNvPicPr/>
                   </pic:nvPicPr>
                   <pic:blipFill>
-                    <a:blip r:embed="rId26"/>
+                    <a:blip r:embed="rId28"/>
                     <a:stretch>
                       <a:fillRect/>
                     </a:stretch>
@@ -4288,7 +5115,7 @@
                     <pic:cNvPicPr/>
                   </pic:nvPicPr>
                   <pic:blipFill>
-                    <a:blip r:embed="rId27"/>
+                    <a:blip r:embed="rId29"/>
                     <a:stretch>
                       <a:fillRect/>
                     </a:stretch>
@@ -4347,7 +5174,7 @@
                     <pic:cNvPicPr/>
                   </pic:nvPicPr>
                   <pic:blipFill>
-                    <a:blip r:embed="rId28"/>
+                    <a:blip r:embed="rId30"/>
                     <a:stretch>
                       <a:fillRect/>
                     </a:stretch>
@@ -4371,10 +5198,14 @@
     <w:p>
       <w:pPr>
         <w:pStyle w:val="Heading3"/>
+        <w:ind w:left="0"/>
       </w:pPr>
       <w:bookmarkStart w:id="21" w:name="_Toc221898869"/>
       <w:r>
         <w:lastRenderedPageBreak/>
+        <w:t>4.</w:t>
+      </w:r>
+      <w:r>
         <w:t>Gauss-Jordan</w:t>
       </w:r>
       <w:bookmarkEnd w:id="21"/>
@@ -4410,7 +5241,7 @@
                     <pic:cNvPicPr/>
                   </pic:nvPicPr>
                   <pic:blipFill>
-                    <a:blip r:embed="rId29"/>
+                    <a:blip r:embed="rId31"/>
                     <a:stretch>
                       <a:fillRect/>
                     </a:stretch>
@@ -4478,7 +5309,7 @@
                     <pic:cNvPicPr/>
                   </pic:nvPicPr>
                   <pic:blipFill>
-                    <a:blip r:embed="rId30"/>
+                    <a:blip r:embed="rId32"/>
                     <a:stretch>
                       <a:fillRect/>
                     </a:stretch>
@@ -4606,21 +5437,23 @@
           <w:szCs w:val="28"/>
         </w:rPr>
         <w:br/>
-        <w:t xml:space="preserve">I picked up some practical knowledge about how numerical methods actually work, as well as developed a stronger ability to understand how iterative algorithms find their solution. I developed greater skill relating to </w:t>
-      </w:r>
+        <w:t xml:space="preserve">I picked up some practical knowledge about how numerical methods </w:t>
+      </w:r>
+      <w:proofErr w:type="gramStart"/>
       <w:r>
         <w:rPr>
           <w:sz w:val="28"/>
           <w:szCs w:val="28"/>
         </w:rPr>
-        <w:t>JavaScript</w:t>
-      </w:r>
+        <w:t>actually work</w:t>
+      </w:r>
+      <w:proofErr w:type="gramEnd"/>
       <w:r>
         <w:rPr>
           <w:sz w:val="28"/>
           <w:szCs w:val="28"/>
         </w:rPr>
-        <w:t xml:space="preserve"> programming, DOM manipulation, input validation, and organizing an entire web application project.</w:t>
+        <w:t>, as well as developed a stronger ability to understand how iterative algorithms find their solution. I developed greater skill relating to JavaScript programming, DOM manipulation, input validation, and organizing an entire web application project.</w:t>
       </w:r>
     </w:p>
     <w:p>
@@ -4629,8 +5462,8 @@
       </w:pPr>
     </w:p>
     <w:sectPr>
-      <w:headerReference w:type="default" r:id="rId31"/>
-      <w:footerReference w:type="default" r:id="rId32"/>
+      <w:headerReference w:type="default" r:id="rId33"/>
+      <w:footerReference w:type="default" r:id="rId34"/>
       <w:pgSz w:w="12240" w:h="15840"/>
       <w:pgMar w:top="1440" w:right="1440" w:bottom="1440" w:left="1440" w:header="720" w:footer="720" w:gutter="0"/>
       <w:cols w:space="720"/>
@@ -4772,11 +5605,10 @@
     <w:lvl w:ilvl="0" w:tplc="68889650">
       <w:start w:val="1"/>
       <w:numFmt w:val="decimal"/>
-      <w:pStyle w:val="Heading3"/>
       <w:lvlText w:val="%1."/>
       <w:lvlJc w:val="left"/>
       <w:pPr>
-        <w:ind w:left="1710" w:hanging="360"/>
+        <w:ind w:left="3060" w:hanging="360"/>
       </w:pPr>
     </w:lvl>
     <w:lvl w:ilvl="1" w:tplc="04090019" w:tentative="1">
@@ -6314,12 +7146,12 @@
     <w:uiPriority w:val="9"/>
     <w:unhideWhenUsed/>
     <w:qFormat/>
-    <w:rsid w:val="00DB7CCC"/>
+    <w:rsid w:val="00EF4123"/>
     <w:pPr>
       <w:numPr>
-        <w:numId w:val="10"/>
+        <w:numId w:val="0"/>
       </w:numPr>
-      <w:ind w:left="3150"/>
+      <w:ind w:left="2700"/>
       <w:outlineLvl w:val="2"/>
     </w:pPr>
     <w:rPr>
@@ -6462,6 +7294,7 @@
   <w:style w:type="character" w:default="1" w:styleId="DefaultParagraphFont">
     <w:name w:val="Default Paragraph Font"/>
     <w:uiPriority w:val="1"/>
+    <w:semiHidden/>
     <w:unhideWhenUsed/>
   </w:style>
   <w:style w:type="table" w:default="1" w:styleId="TableNormal">
@@ -6516,7 +7349,7 @@
     <w:basedOn w:val="DefaultParagraphFont"/>
     <w:link w:val="Heading3"/>
     <w:uiPriority w:val="9"/>
-    <w:rsid w:val="00DB7CCC"/>
+    <w:rsid w:val="00EF4123"/>
     <w:rPr>
       <w:rFonts w:asciiTheme="majorHAnsi" w:eastAsiaTheme="majorEastAsia" w:hAnsiTheme="majorHAnsi" w:cstheme="majorBidi"/>
       <w:color w:val="0F4761" w:themeColor="accent1" w:themeShade="BF"/>

</xml_diff>